<commit_message>
security: sanitize demo data and provider configuration
</commit_message>
<xml_diff>
--- a/demo_assets/01_企业基本资料汇编.docx
+++ b/demo_assets/01_企业基本资料汇编.docx
@@ -14,7 +14,7 @@
           <w:color w:val="0B2545"/>
           <w:sz w:val="40"/>
         </w:rPr>
-        <w:t>江苏清源新材料有限公司 环保资料汇编</w:t>
+        <w:t>示例环保科技有限公司 环保资料汇编</w:t>
       </w:r>
     </w:p>
     <w:p>
@@ -91,7 +91,7 @@
                 <w:color w:val="222222"/>
                 <w:sz w:val="21"/>
               </w:rPr>
-              <w:t>年产 2 万吨水性树脂及配套环保设施提升项目</w:t>
+              <w:t>示例树脂生产及配套环保设施提升项目</w:t>
             </w:r>
           </w:p>
         </w:tc>
@@ -136,7 +136,7 @@
                 <w:color w:val="222222"/>
                 <w:sz w:val="21"/>
               </w:rPr>
-              <w:t>江苏清源新材料有限公司</w:t>
+              <w:t>示例环保科技有限公司</w:t>
             </w:r>
           </w:p>
         </w:tc>
@@ -181,7 +181,7 @@
                 <w:color w:val="222222"/>
                 <w:sz w:val="21"/>
               </w:rPr>
-              <w:t>91320500DEMO20260001</w:t>
+              <w:t>DEMO-CREDIT-2026-0001</w:t>
             </w:r>
           </w:p>
         </w:tc>
@@ -226,7 +226,7 @@
                 <w:color w:val="222222"/>
                 <w:sz w:val="21"/>
               </w:rPr>
-              <w:t>江苏省苏州市吴中区环保产业园清源路 18 号</w:t>
+              <w:t>示例省示例市环保产业园示例路 18 号</w:t>
             </w:r>
           </w:p>
         </w:tc>
@@ -316,7 +316,7 @@
                 <w:color w:val="222222"/>
                 <w:sz w:val="21"/>
               </w:rPr>
-              <w:t>张工，0512-68880001</w:t>
+              <w:t>示例联系人，400-000-0000</w:t>
             </w:r>
           </w:p>
         </w:tc>

</xml_diff>